<commit_message>
Add GLPI MariaDB integration and update related components
- Introduced GLPI database configuration options in .env.example
- Added GLPI ticket search functionality in glpiMariaRepository
- Updated crRoutes to utilize new GLPI ticket search method
- Enhanced IssueEditor component to manage GLPI ticket previews
- Modified styles for improved layout in issue initiation section
- Updated README with new GLPI integration instructions
- Added mysql2 dependency for database interactions
</commit_message>
<xml_diff>
--- a/templates/cr_transport/cr_transport.docx
+++ b/templates/cr_transport/cr_transport.docx
@@ -555,22 +555,120 @@
                 <w:sz w:val="18"/>
                 <w:szCs w:val="18"/>
               </w:rPr>
-              <w:t>Analysis :</w:t>
+              <w:t>Analysis</w:t>
+            </w:r>
+            <w:bookmarkStart w:id="0" w:name="_GoBack"/>
+            <w:bookmarkEnd w:id="0"/>
+            <w:r>
+              <w:rPr>
+                <w:rFonts w:ascii="Tahoma" w:hAnsi="Tahoma" w:cs="Tahoma"/>
+                <w:b/>
+                <w:sz w:val="18"/>
+                <w:szCs w:val="18"/>
+              </w:rPr>
+              <w:t xml:space="preserve"> </w:t>
+            </w:r>
+            <w:r>
+              <w:rPr>
+                <w:rFonts w:ascii="Tahoma" w:hAnsi="Tahoma" w:cs="Tahoma"/>
+                <w:b/>
+                <w:sz w:val="18"/>
+                <w:szCs w:val="18"/>
+              </w:rPr>
+              <w:t>:</w:t>
             </w:r>
             <w:proofErr w:type="gramEnd"/>
-            <w:r>
+          </w:p>
+          <w:p>
+            <w:pPr>
+              <w:ind w:left="9" w:hanging="9"/>
+              <w:rPr>
+                <w:rFonts w:ascii="Tahoma" w:hAnsi="Tahoma" w:cs="Tahoma"/>
+                <w:sz w:val="18"/>
+                <w:szCs w:val="18"/>
+              </w:rPr>
+            </w:pPr>
+            <w:r>
+              <w:rPr>
+                <w:rFonts w:ascii="Tahoma" w:hAnsi="Tahoma" w:cs="Tahoma"/>
+                <w:sz w:val="18"/>
+                <w:szCs w:val="18"/>
+                <w:highlight w:val="yellow"/>
+              </w:rPr>
+              <w:t>[</w:t>
+            </w:r>
+            <w:r>
+              <w:rPr>
+                <w:rFonts w:ascii="Tahoma" w:hAnsi="Tahoma" w:cs="Tahoma"/>
+                <w:sz w:val="18"/>
+                <w:szCs w:val="18"/>
+                <w:highlight w:val="yellow"/>
+              </w:rPr>
+              <w:t>Problem</w:t>
+            </w:r>
+            <w:r>
+              <w:rPr>
+                <w:rFonts w:ascii="Tahoma" w:hAnsi="Tahoma" w:cs="Tahoma"/>
+                <w:sz w:val="18"/>
+                <w:szCs w:val="18"/>
+                <w:highlight w:val="yellow"/>
+              </w:rPr>
+              <w:t>]</w:t>
+            </w:r>
+          </w:p>
+          <w:p>
+            <w:pPr>
+              <w:ind w:left="9" w:hanging="9"/>
+              <w:rPr>
+                <w:rFonts w:ascii="Tahoma" w:hAnsi="Tahoma" w:cs="Tahoma"/>
+                <w:sz w:val="18"/>
+                <w:szCs w:val="18"/>
+              </w:rPr>
+            </w:pPr>
+          </w:p>
+          <w:p>
+            <w:pPr>
+              <w:ind w:left="1800" w:hanging="1800"/>
               <w:rPr>
                 <w:rFonts w:ascii="Tahoma" w:hAnsi="Tahoma" w:cs="Tahoma"/>
                 <w:b/>
                 <w:sz w:val="18"/>
                 <w:szCs w:val="18"/>
               </w:rPr>
-              <w:t xml:space="preserve"> </w:t>
-            </w:r>
-          </w:p>
-          <w:p>
-            <w:pPr>
-              <w:ind w:left="1800" w:hanging="1800"/>
+            </w:pPr>
+            <w:r>
+              <w:rPr>
+                <w:rFonts w:ascii="Tahoma" w:hAnsi="Tahoma" w:cs="Tahoma"/>
+                <w:b/>
+                <w:sz w:val="18"/>
+                <w:szCs w:val="18"/>
+              </w:rPr>
+              <w:t xml:space="preserve">Impact </w:t>
+            </w:r>
+            <w:proofErr w:type="gramStart"/>
+            <w:r>
+              <w:rPr>
+                <w:rFonts w:ascii="Tahoma" w:hAnsi="Tahoma" w:cs="Tahoma"/>
+                <w:b/>
+                <w:sz w:val="18"/>
+                <w:szCs w:val="18"/>
+              </w:rPr>
+              <w:t xml:space="preserve">Analysis </w:t>
+            </w:r>
+            <w:r>
+              <w:rPr>
+                <w:rFonts w:ascii="Tahoma" w:hAnsi="Tahoma" w:cs="Tahoma"/>
+                <w:b/>
+                <w:sz w:val="18"/>
+                <w:szCs w:val="18"/>
+              </w:rPr>
+              <w:t>:</w:t>
+            </w:r>
+            <w:proofErr w:type="gramEnd"/>
+          </w:p>
+          <w:p>
+            <w:pPr>
+              <w:ind w:left="9" w:hanging="9"/>
               <w:rPr>
                 <w:rFonts w:ascii="Tahoma" w:hAnsi="Tahoma" w:cs="Tahoma"/>
                 <w:sz w:val="18"/>
@@ -584,95 +682,7 @@
                 <w:szCs w:val="18"/>
                 <w:highlight w:val="yellow"/>
               </w:rPr>
-              <w:t>[</w:t>
-            </w:r>
-            <w:r>
-              <w:rPr>
-                <w:rFonts w:ascii="Tahoma" w:hAnsi="Tahoma" w:cs="Tahoma"/>
-                <w:sz w:val="18"/>
-                <w:szCs w:val="18"/>
-                <w:highlight w:val="yellow"/>
-              </w:rPr>
-              <w:t>Problem]</w:t>
-            </w:r>
-          </w:p>
-          <w:p>
-            <w:pPr>
-              <w:ind w:left="1800" w:hanging="1800"/>
-              <w:rPr>
-                <w:rFonts w:ascii="Tahoma" w:hAnsi="Tahoma" w:cs="Tahoma"/>
-                <w:b/>
-                <w:sz w:val="18"/>
-                <w:szCs w:val="18"/>
-              </w:rPr>
-            </w:pPr>
-          </w:p>
-          <w:p>
-            <w:pPr>
-              <w:ind w:left="1800" w:hanging="1800"/>
-              <w:rPr>
-                <w:rFonts w:ascii="Tahoma" w:hAnsi="Tahoma" w:cs="Tahoma"/>
-                <w:b/>
-                <w:sz w:val="18"/>
-                <w:szCs w:val="18"/>
-              </w:rPr>
-            </w:pPr>
-            <w:r>
-              <w:rPr>
-                <w:rFonts w:ascii="Tahoma" w:hAnsi="Tahoma" w:cs="Tahoma"/>
-                <w:b/>
-                <w:sz w:val="18"/>
-                <w:szCs w:val="18"/>
-              </w:rPr>
-              <w:t xml:space="preserve">Impact Analysis </w:t>
-            </w:r>
-            <w:proofErr w:type="gramStart"/>
-            <w:r>
-              <w:rPr>
-                <w:rFonts w:ascii="Tahoma" w:hAnsi="Tahoma" w:cs="Tahoma"/>
-                <w:b/>
-                <w:sz w:val="18"/>
-                <w:szCs w:val="18"/>
-              </w:rPr>
-              <w:t xml:space="preserve">  :</w:t>
-            </w:r>
-            <w:proofErr w:type="gramEnd"/>
-          </w:p>
-          <w:p>
-            <w:pPr>
-              <w:ind w:left="9" w:hanging="9"/>
-              <w:rPr>
-                <w:rFonts w:ascii="Tahoma" w:hAnsi="Tahoma" w:cs="Tahoma"/>
-                <w:sz w:val="18"/>
-                <w:szCs w:val="18"/>
-              </w:rPr>
-            </w:pPr>
-            <w:r>
-              <w:rPr>
-                <w:rFonts w:ascii="Tahoma" w:hAnsi="Tahoma" w:cs="Tahoma"/>
-                <w:sz w:val="18"/>
-                <w:szCs w:val="18"/>
-                <w:highlight w:val="yellow"/>
-              </w:rPr>
-              <w:t>[</w:t>
-            </w:r>
-            <w:r>
-              <w:rPr>
-                <w:rFonts w:ascii="Tahoma" w:hAnsi="Tahoma" w:cs="Tahoma"/>
-                <w:sz w:val="18"/>
-                <w:szCs w:val="18"/>
-                <w:highlight w:val="yellow"/>
-              </w:rPr>
-              <w:t>Impact</w:t>
-            </w:r>
-            <w:r>
-              <w:rPr>
-                <w:rFonts w:ascii="Tahoma" w:hAnsi="Tahoma" w:cs="Tahoma"/>
-                <w:sz w:val="18"/>
-                <w:szCs w:val="18"/>
-                <w:highlight w:val="yellow"/>
-              </w:rPr>
-              <w:t>]</w:t>
+              <w:t>[Impact]</w:t>
             </w:r>
           </w:p>
         </w:tc>
@@ -1154,8 +1164,6 @@
               </w:rPr>
               <w:t>William Febrian</w:t>
             </w:r>
-            <w:bookmarkStart w:id="0" w:name="_GoBack"/>
-            <w:bookmarkEnd w:id="0"/>
           </w:p>
         </w:tc>
       </w:tr>
@@ -3581,6 +3589,8 @@
         <w:rPr>
           <w:rFonts w:ascii="Symbol" w:hAnsi="Symbol" w:cs="Symbol"/>
           <w:b/>
+          <w:noProof/>
+          <w:lang w:eastAsia="en-US"/>
         </w:rPr>
         <mc:AlternateContent>
           <mc:Choice Requires="wps">
@@ -3721,6 +3731,8 @@
         <w:rPr>
           <w:rFonts w:ascii="Symbol" w:hAnsi="Symbol" w:cs="Symbol"/>
           <w:b/>
+          <w:noProof/>
+          <w:lang w:eastAsia="en-US"/>
         </w:rPr>
         <mc:AlternateContent>
           <mc:Choice Requires="wps">
@@ -3875,6 +3887,8 @@
         <w:rPr>
           <w:rFonts w:ascii="Symbol" w:hAnsi="Symbol" w:cs="Symbol"/>
           <w:b/>
+          <w:noProof/>
+          <w:lang w:eastAsia="en-US"/>
         </w:rPr>
         <mc:AlternateContent>
           <mc:Choice Requires="wps">
@@ -4011,6 +4025,8 @@
         <w:rPr>
           <w:rFonts w:ascii="Symbol" w:hAnsi="Symbol" w:cs="Symbol"/>
           <w:b/>
+          <w:noProof/>
+          <w:lang w:eastAsia="en-US"/>
         </w:rPr>
         <mc:AlternateContent>
           <mc:Choice Requires="wps">
@@ -4101,6 +4117,8 @@
         <w:rPr>
           <w:rFonts w:ascii="Symbol" w:hAnsi="Symbol" w:cs="Symbol"/>
           <w:b/>
+          <w:noProof/>
+          <w:lang w:eastAsia="en-US"/>
         </w:rPr>
         <mc:AlternateContent>
           <mc:Choice Requires="wps">
@@ -5702,7 +5720,7 @@
   <w:style w:type="paragraph" w:default="1" w:styleId="Normal">
     <w:name w:val="Normal"/>
     <w:qFormat/>
-    <w:rsid w:val="00B079F0"/>
+    <w:rsid w:val="00196999"/>
     <w:rPr>
       <w:sz w:val="24"/>
       <w:szCs w:val="24"/>
@@ -6123,7 +6141,7 @@
 </file>
 
 <file path=customXml/itemProps1.xml><?xml version="1.0" encoding="utf-8"?>
-<ds:datastoreItem xmlns:ds="http://schemas.openxmlformats.org/officeDocument/2006/customXml" ds:itemID="{B851C46F-C2E5-4D6A-B9D6-CCA58CE4D92E}">
+<ds:datastoreItem xmlns:ds="http://schemas.openxmlformats.org/officeDocument/2006/customXml" ds:itemID="{FDA918E8-02CF-4BCF-86DE-E9A19959F328}">
   <ds:schemaRefs>
     <ds:schemaRef ds:uri="http://schemas.openxmlformats.org/officeDocument/2006/bibliography"/>
   </ds:schemaRefs>

</xml_diff>